<commit_message>
update: sync DacTa, CSDL docs and frontend
Align specs with soft-hide admin flows, multi gym/specialty UI, auth P2 (phone, remember-me, legal pages, forgot-password UI), and README.

Co-authored-by: Cursor <cursoragent@cursor.com>
</commit_message>
<xml_diff>
--- a/docs/GymFinder_DacTaDuAn.docx
+++ b/docs/GymFinder_DacTaDuAn.docx
@@ -1,6 +1,6 @@
 
 <file path=word/document.xml><?xml version="1.0" encoding="utf-8"?>
-<w:document xmlns:wpc="http://schemas.microsoft.com/office/word/2010/wordprocessingCanvas" xmlns:cx="http://schemas.microsoft.com/office/drawing/2014/chartex" xmlns:cx1="http://schemas.microsoft.com/office/drawing/2015/9/8/chartex" xmlns:cx2="http://schemas.microsoft.com/office/drawing/2015/10/21/chartex" xmlns:cx3="http://schemas.microsoft.com/office/drawing/2016/5/9/chartex" xmlns:cx4="http://schemas.microsoft.com/office/drawing/2016/5/10/chartex" xmlns:cx5="http://schemas.microsoft.com/office/drawing/2016/5/11/chartex" xmlns:cx6="http://schemas.microsoft.com/office/drawing/2016/5/12/chartex" xmlns:cx7="http://schemas.microsoft.com/office/drawing/2016/5/13/chartex" xmlns:cx8="http://schemas.microsoft.com/office/drawing/2016/5/14/chartex" xmlns:mc="http://schemas.openxmlformats.org/markup-compatibility/2006" xmlns:aink="http://schemas.microsoft.com/office/drawing/2016/ink" xmlns:am3d="http://schemas.microsoft.com/office/drawing/2017/model3d" xmlns:o="urn:schemas-microsoft-com:office:office" xmlns:oel="http://schemas.microsoft.com/office/2019/extlst" xmlns:r="http://schemas.openxmlformats.org/officeDocument/2006/relationships" xmlns:m="http://schemas.openxmlformats.org/officeDocument/2006/math" xmlns:v="urn:schemas-microsoft-com:vml" xmlns:wp14="http://schemas.microsoft.com/office/word/2010/wordprocessingDrawing" xmlns:wp="http://schemas.openxmlformats.org/drawingml/2006/wordprocessingDrawing" xmlns:w10="urn:schemas-microsoft-com:office:word" xmlns:w="http://schemas.openxmlformats.org/wordprocessingml/2006/main" xmlns:w14="http://schemas.microsoft.com/office/word/2010/wordml" xmlns:w15="http://schemas.microsoft.com/office/word/2012/wordml" xmlns:w16cex="http://schemas.microsoft.com/office/word/2018/wordml/cex" xmlns:w16cid="http://schemas.microsoft.com/office/word/2016/wordml/cid" xmlns:w16="http://schemas.microsoft.com/office/word/2018/wordml" xmlns:w16sdtdh="http://schemas.microsoft.com/office/word/2020/wordml/sdtdatahash" xmlns:w16se="http://schemas.microsoft.com/office/word/2015/wordml/symex" xmlns:wpg="http://schemas.microsoft.com/office/word/2010/wordprocessingGroup" xmlns:wpi="http://schemas.microsoft.com/office/word/2010/wordprocessingInk" xmlns:wne="http://schemas.microsoft.com/office/word/2006/wordml" xmlns:wps="http://schemas.microsoft.com/office/word/2010/wordprocessingShape" mc:Ignorable="w14 w15 w16se w16cid w16 w16cex w16sdtdh wp14">
+<w:document xmlns:ns1="http://schemas.openxmlformats.org/markup-compatibility/2006" xmlns:ns2="http://schemas.openxmlformats.org/officeDocument/2006/relationships" xmlns:w="http://schemas.openxmlformats.org/wordprocessingml/2006/main" ns1:Ignorable="w14 w15 w16se w16cid w16 w16cex w16sdtdh wp14">
   <w:body>
     <w:p>
       <w:pPr>
@@ -459,7 +459,7 @@
         <w:spacing w:after="40"/>
       </w:pPr>
       <w:r>
-        <w:t>Tìm kiếm và xem hồ sơ PT; một PT có thể có nhiều chuyên môn.</w:t>
+        <w:t>Tìm kiếm và xem hồ sơ PT; một PT có thể có nhiều chuyên môn; một PT có thể liên kết với nhiều phòng tập và một phòng tập có thể có nhiều PT.</w:t>
       </w:r>
     </w:p>
     <w:p>
@@ -999,7 +999,7 @@
               <w:rPr>
                 <w:sz w:val="17"/>
               </w:rPr>
-              <w:t>Nhập thông tin bắt buộc; kiểm tra hợp lệ và thông báo lỗi rõ ràng.</w:t>
+              <w:t>Nhập họ tên, email, mật khẩu (bắt buộc) và số điện thoại (tuỳ chọn); bắt buộc đồng ý Điều khoản dịch vụ và Chính sách bảo mật; kiểm tra hợp lệ và thông báo lỗi rõ ràng.</w:t>
             </w:r>
           </w:p>
         </w:tc>
@@ -1059,7 +1059,7 @@
               <w:rPr>
                 <w:sz w:val="17"/>
               </w:rPr>
-              <w:t>Xác thực thông tin; báo lỗi phù hợp khi không đúng.</w:t>
+              <w:t>Đăng nhập bằng email hoặc số điện thoại đã đăng ký; hỗ trợ Ghi nhớ đăng nhập (cookie phiên tối đa khoảng 30 ngày); báo lỗi phù hợp khi thông tin không đúng hoặc tài khoản bị khóa.</w:t>
             </w:r>
           </w:p>
         </w:tc>
@@ -1116,7 +1116,7 @@
               <w:rPr>
                 <w:sz w:val="17"/>
               </w:rPr>
-              <w:t>Kết thúc phiên và chuyển về trang phù hợp.</w:t>
+              <w:t>Kết thúc phiên, xóa/hết hạn cookie đăng nhập và chuyển về trang phù hợp.</w:t>
             </w:r>
           </w:p>
         </w:tc>
@@ -1240,6 +1240,14 @@
       </w:tr>
     </w:tbl>
     <w:p/>
+    <w:p>
+      <w:pPr>
+        <w:pStyle w:val="Heading2"/>
+      </w:pPr>
+      <w:r>
+        <w:t>AUTH-06 — Quên mật khẩu: giao diện thu thập email/SĐT và xác nhận đã ghi nhận yêu cầu (P2). Gửi email đặt lại mật khẩu và token phía máy chủ chưa thuộc phạm vi bắt buộc P0; khi kích hoạt phải bổ sung quy trình bảo mật tương ứng.</w:t>
+      </w:r>
+    </w:p>
     <w:p>
       <w:pPr>
         <w:pStyle w:val="Heading2"/>
@@ -1777,7 +1785,7 @@
               <w:rPr>
                 <w:sz w:val="17"/>
               </w:rPr>
-              <w:t>Nếu có bộ lọc này, chỉ trả về phòng tập có ít nhất một PT đang hoạt động được liên kết.</w:t>
+              <w:t>Nếu có bộ lọc này, chỉ trả về phòng tập có ít nhất một PT đang hoạt động được liên kết qua quan hệ Gym–Trainer.</w:t>
             </w:r>
           </w:p>
         </w:tc>
@@ -1963,7 +1971,7 @@
         <w:spacing w:after="40"/>
       </w:pPr>
       <w:r>
-        <w:t>Cho phép xem danh sách PT và tìm/lọc theo từ khóa, khu vực, chuyên môn hoặc tiêu chí đang hỗ trợ.</w:t>
+        <w:t>Cho phép xem danh sách PT và tìm/lọc theo từ khóa, khu vực, chuyên môn, phòng tập liên kết hoặc tiêu chí đang hỗ trợ. Kết quả không trùng một PT chỉ vì PT liên kết với nhiều phòng tập.</w:t>
       </w:r>
     </w:p>
     <w:p>
@@ -1972,7 +1980,7 @@
         <w:spacing w:after="40"/>
       </w:pPr>
       <w:r>
-        <w:t>Hồ sơ PT hiển thị họ tên, ảnh, giới thiệu, kinh nghiệm, danh sách chuyên môn, phòng tập liên kết, thông tin liên hệ và đánh giá đã duyệt.</w:t>
+        <w:t>Hồ sơ PT hiển thị họ tên, ảnh, giới thiệu, kinh nghiệm, danh sách chuyên môn, danh sách phòng tập đang liên kết (chỉ phòng tập đang hoạt động trên giao diện công khai), thông tin liên hệ và đánh giá đã duyệt. Không tạo hồ sơ PT trùng chỉ vì PT làm việc tại nhiều phòng tập.</w:t>
       </w:r>
     </w:p>
     <w:p>
@@ -1981,7 +1989,8 @@
         <w:spacing w:after="40"/>
       </w:pPr>
       <w:r>
-        <w:t>Một PT có thể có nhiều chuyên môn; một chuyên môn có thể được gán cho nhiều PT.</w:t>
+        <w:rPr/>
+        <w:t>Một PT có thể có nhiều chuyên môn; một chuyên môn có thể được gán cho nhiều PT (quan hệ nhiều–nhiều, lưu qua bảng trung gian trainer_specialties trong CSDL).</w:t>
       </w:r>
     </w:p>
     <w:p>
@@ -3060,7 +3069,7 @@
         <w:spacing w:after="40"/>
       </w:pPr>
       <w:r>
-        <w:t>Ẩn/hiện phòng tập khi cần; ưu tiên ẩn thay vì xóa cứng nếu còn dữ liệu liên quan.</w:t>
+        <w:t>Quản lý trạng thái và tạm ẩn/kích hoạt lại: Cho phép Admin tạm ẩn hoặc kích hoạt lại phòng tập theo quyền quản trị. Phòng tập tạm ẩn không xuất hiện trong danh sách công khai, bộ lọc tìm kiếm và danh sách yêu thích của người dùng. Toàn bộ dữ liệu liên quan (tiện ích, danh mục, hình ảnh, đánh giá và danh sách liên kết HLV–phòng tập) được giữ lại nguyên vẹn. Tạm ẩn phòng tập không xóa bản ghi PT và không tự gỡ toàn bộ liên kết; trên giao diện công khai chỉ ẩn phòng tập đó khỏi danh sách nơi làm việc của PT. Admin có thể kích hoạt lại bất kỳ lúc nào. Hệ thống không cung cấp thao tác Xóa cứng phòng tập trên giao diện quản trị; ngừng hiển thị chỉ thực hiện qua Tạm ẩn để bảo toàn lịch sử đánh giá và liên kết.</w:t>
       </w:r>
     </w:p>
     <w:p>
@@ -3095,7 +3104,7 @@
         <w:spacing w:after="40"/>
       </w:pPr>
       <w:r>
-        <w:t>Thêm, xem, sửa và cập nhật trạng thái PT.</w:t>
+        <w:t>Admin có thể thêm, xem, sửa, tạm ẩn và kích hoạt lại HLV (PT) theo quyền quản trị được cấp. Hệ thống không cung cấp thao tác Xóa cứng HLV trên giao diện quản trị; ngừng hiển thị chỉ thực hiện qua Tạm ẩn để bảo toàn đánh giá, yêu thích và liên kết phòng tập/chuyên môn.</w:t>
       </w:r>
     </w:p>
     <w:p>
@@ -3113,7 +3122,7 @@
         <w:spacing w:after="40"/>
       </w:pPr>
       <w:r>
-        <w:t>Liên kết PT với phòng tập chính theo nghiệp vụ dự án.</w:t>
+        <w:t>Liên kết PT với một hoặc nhiều phòng tập theo quan hệ nhiều–nhiều. Mỗi PT trong phạm vi hiện tại phải liên kết với ít nhất một phòng tập; không hỗ trợ PT tự do không gắn phòng tập. Admin gán/bỏ liên kết trên cùng một hồ sơ PT, không nhân bản bản ghi PT.</w:t>
       </w:r>
     </w:p>
     <w:p>
@@ -3131,7 +3140,7 @@
         <w:spacing w:after="40"/>
       </w:pPr>
       <w:r>
-        <w:t>Trang chi tiết và bộ lọc phải phản ánh đúng các chuyên môn được gán.</w:t>
+        <w:t>Trang chi tiết và bộ lọc phải phản ánh đúng các chuyên môn được gán. Tạm ẩn HLV giữ nguyên vẹn bản ghi và toàn bộ dữ liệu liên quan (đánh giá, yêu thích, chuyên môn, các liên kết phòng tập); HLV tạm ẩn không xuất hiện trong danh sách công khai, kết quả tìm kiếm, trang chủ và danh sách yêu thích; truy cập trực tiếp URL chi tiết HLV trả về mã lỗi 404 Not Found. Không tự động xóa đánh giá hoặc dữ liệu lịch sử chỉ vì HLV bị tạm ẩn; Admin có thể kích hoạt lại bất cứ lúc nào. Hệ thống không cung cấp thao tác Xóa cứng HLV trên giao diện quản trị; ngừng hiển thị chỉ thực hiện qua Tạm ẩn. Mọi thay đổi trạng thái chỉ báo thành công khi Backend xác nhận; nếu request thất bại thì giữ nguyên trạng thái trên UI.</w:t>
       </w:r>
     </w:p>
     <w:p>
@@ -3201,7 +3210,7 @@
         <w:spacing w:after="40"/>
       </w:pPr>
       <w:r>
-        <w:t>Khóa/mở khóa tài khoản theo quyền Admin.</w:t>
+        <w:t>Khóa/mở khóa tài khoản theo quyền Admin. Giao diện quản trị chỉ cung cấp Khóa / Mở khóa; không có nút Xóa tài khoản người dùng. Khóa tài khoản chuyển trạng thái sang bị khóa (locked); người dùng bị khóa không thể đăng nhập hoặc thực hiện thao tác User; khóa tài khoản tuyệt đối không làm mất dữ liệu lịch sử đánh giá hoặc danh sách yêu thích. Mở khóa khôi phục trạng thái hoạt động (active). Nếu sau này bổ sung xóa tài khoản, phải có quy tắc riêng theo thiết kế CSDL và bảo toàn dữ liệu lịch sử.</w:t>
       </w:r>
     </w:p>
     <w:p>
@@ -3554,14 +3563,8 @@
             <w:vAlign w:val="center"/>
           </w:tcPr>
           <w:p>
-            <w:pPr>
-              <w:spacing w:after="20"/>
-            </w:pPr>
-            <w:r>
-              <w:rPr>
-                <w:sz w:val="17"/>
-              </w:rPr>
-              <w:t>Phòng tập/PT ẩn hoặc không hoạt động không xuất hiện trong tìm kiếm công khai.</w:t>
+            <w:r>
+              <w:t>Phòng tập hoặc PT tạm ẩn/không hoạt động không xuất hiện trong tìm kiếm, danh mục công khai, trang chủ và danh sách yêu thích; truy cập URL chi tiết trực tiếp sẽ trả về mã lỗi 404 Not Found.</w:t>
             </w:r>
           </w:p>
         </w:tc>
@@ -3603,7 +3606,7 @@
               <w:rPr>
                 <w:sz w:val="17"/>
               </w:rPr>
-              <w:t>Một PT có thể có nhiều chuyên môn; lọc theo chuyên môn trả về mọi PT được gán chuyên môn đó.</w:t>
+              <w:t>Một PT có thể có nhiều chuyên môn; lọc theo chuyên môn trả về mọi PT được gán chuyên môn đó. Một PT có thể liên kết với nhiều phòng tập và một phòng tập có thể liên kết với nhiều PT (quan hệ nhiều–nhiều); mỗi PT phải có ít nhất một liên kết phòng tập; không tạo PT tự do; không nhân bản hồ sơ PT khi gán thêm phòng tập.</w:t>
             </w:r>
           </w:p>
         </w:tc>
@@ -3802,6 +3805,50 @@
           <w:p>
             <w:r>
               <w:t>Admin từ chối đánh giá bắt buộc phải nhập lý do từ chối (không để trống hoặc chỉ có khoảng trắng); đánh giá bị từ chối không được hiển thị công khai và gắn kèm lý do để người dùng theo dõi.</w:t>
+            </w:r>
+          </w:p>
+        </w:tc>
+      </w:tr>
+      <w:tr>
+        <w:tc>
+          <w:tcPr>
+            <w:tcW w:type="dxa" w:w="4963"/>
+          </w:tcPr>
+          <w:p>
+            <w:r>
+              <w:t>BR-11</w:t>
+            </w:r>
+          </w:p>
+        </w:tc>
+        <w:tc>
+          <w:tcPr>
+            <w:tcW w:type="dxa" w:w="4963"/>
+          </w:tcPr>
+          <w:p>
+            <w:r>
+              <w:t>Với phòng tập và HLV, hệ thống chỉ dùng Tạm ẩn / Kích hoạt lại để quản lý hiển thị công khai; không có nút Xóa cứng trên giao diện quản trị. Tạm ẩn giữ nguyên vẹn dữ liệu để Admin có thể kích hoạt lại. (Thao tác xóa cứng nếu có ở các đối tượng khác như đánh giá vẫn là quy trình riêng, có xác nhận khi áp dụng.)</w:t>
+            </w:r>
+          </w:p>
+        </w:tc>
+      </w:tr>
+      <w:tr>
+        <w:tc>
+          <w:tcPr>
+            <w:tcW w:type="dxa" w:w="4963"/>
+          </w:tcPr>
+          <w:p>
+            <w:r>
+              <w:t>BR-12</w:t>
+            </w:r>
+          </w:p>
+        </w:tc>
+        <w:tc>
+          <w:tcPr>
+            <w:tcW w:type="dxa" w:w="4963"/>
+          </w:tcPr>
+          <w:p>
+            <w:r>
+              <w:t>Khóa/mở khóa tài khoản User không làm mất dữ liệu lịch sử đánh giá hay yêu thích. Giao diện quản trị không được giả lập kết quả thành công khi Backend chưa hỗ trợ hoặc request thất bại; chỉ cập nhật giao diện khi Backend xác nhận thành công.</w:t>
             </w:r>
           </w:p>
         </w:tc>
@@ -4448,14 +4495,8 @@
             <w:vAlign w:val="center"/>
           </w:tcPr>
           <w:p>
-            <w:pPr>
-              <w:spacing w:after="20"/>
-            </w:pPr>
-            <w:r>
-              <w:rPr>
-                <w:sz w:val="17"/>
-              </w:rPr>
-              <w:t>Chỉ mục đang công khai/hoạt động xuất hiện trong tìm kiếm công khai.</w:t>
+            <w:r>
+              <w:t>Hoạt động (active) hoặc Tạm ẩn (hidden); chỉ mục đang hoạt động xuất hiện trong tìm kiếm, danh mục công khai và trang chủ; mục tạm ẩn được lưu giữ toàn vẹn dữ liệu để Admin có thể kích hoạt lại.</w:t>
             </w:r>
           </w:p>
         </w:tc>
@@ -4490,14 +4531,8 @@
             <w:vAlign w:val="center"/>
           </w:tcPr>
           <w:p>
-            <w:pPr>
-              <w:spacing w:after="20"/>
-            </w:pPr>
-            <w:r>
-              <w:rPr>
-                <w:sz w:val="17"/>
-              </w:rPr>
-              <w:t>Chỉ PT đang hoạt động/được hiển thị xuất hiện công khai.</w:t>
+            <w:r>
+              <w:t>Hoạt động (active) hoặc Tạm ẩn (hidden); chỉ PT đang hoạt động xuất hiện công khai; PT tạm ẩn bị loại khỏi tìm kiếm, danh mục, danh sách yêu thích và trang chi tiết trả về 404, bảo toàn toàn bộ đánh giá lịch sử.</w:t>
             </w:r>
           </w:p>
         </w:tc>
@@ -4572,14 +4607,8 @@
             <w:vAlign w:val="center"/>
           </w:tcPr>
           <w:p>
-            <w:pPr>
-              <w:spacing w:after="20"/>
-            </w:pPr>
-            <w:r>
-              <w:rPr>
-                <w:sz w:val="17"/>
-              </w:rPr>
-              <w:t>Đang hoạt động hoặc bị khóa; tài khoản khóa không được thực hiện thao tác User.</w:t>
+            <w:r>
+              <w:t>Đang hoạt động (active) hoặc Bị khóa (locked); tài khoản khóa không thể đăng nhập hay thực hiện thao tác User, nhưng toàn bộ lịch sử đánh giá được giữ nguyên vẹn.</w:t>
             </w:r>
           </w:p>
         </w:tc>
@@ -4937,30 +4966,28 @@
         <w:tc>
           <w:tcPr>
             <w:tcW w:w="4968" w:type="dxa"/>
-            <w:shd w:val="clear" w:color="auto" w:fill="F2F6FC"/>
-            <w:vAlign w:val="center"/>
-          </w:tcPr>
-          <w:p>
-            <w:pPr>
-              <w:spacing w:after="20"/>
-            </w:pPr>
-            <w:r>
-              <w:rPr>
-                <w:sz w:val="17"/>
-              </w:rPr>
-              <w:t>AC-06</w:t>
+            <w:vAlign w:val="center"/>
+          </w:tcPr>
+          <w:p>
+            <w:pPr>
+              <w:spacing w:after="20"/>
+            </w:pPr>
+            <w:r>
+              <w:t>AC-05b</w:t>
             </w:r>
           </w:p>
         </w:tc>
         <w:tc>
           <w:tcPr>
             <w:tcW w:w="4968" w:type="dxa"/>
-            <w:shd w:val="clear" w:color="auto" w:fill="F2F6FC"/>
-            <w:vAlign w:val="center"/>
-          </w:tcPr>
-          <w:p>
-            <w:r>
-              <w:t>User đăng ký/đăng nhập/đăng xuất, xem và cập nhật hồ sơ cá nhân, đổi mật khẩu.</w:t>
+            <w:vAlign w:val="center"/>
+          </w:tcPr>
+          <w:p>
+            <w:pPr>
+              <w:spacing w:after="20"/>
+            </w:pPr>
+            <w:r>
+              <w:t>Một PT có thể liên kết với nhiều phòng tập trên cùng một hồ sơ; danh sách tìm kiếm PT không hiển thị trùng một PT chỉ vì PT liên kết với nhiều phòng tập.</w:t>
             </w:r>
           </w:p>
         </w:tc>
@@ -4980,10 +5007,7 @@
               <w:spacing w:after="20"/>
             </w:pPr>
             <w:r>
-              <w:rPr>
-                <w:sz w:val="17"/>
-              </w:rPr>
-              <w:t>AC-07</w:t>
+              <w:t>AC-05c</w:t>
             </w:r>
           </w:p>
         </w:tc>
@@ -4997,10 +5021,7 @@
               <w:spacing w:after="20"/>
             </w:pPr>
             <w:r>
-              <w:rPr>
-                <w:sz w:val="17"/>
-              </w:rPr>
-              <w:t>User thêm/bỏ yêu thích phòng tập và PT; danh sách không trùng mục.</w:t>
+              <w:t>Lọc PT theo phòng tập (nếu bộ lọc được cung cấp) trả về các PT đang liên kết với phòng tập được chọn.</w:t>
             </w:r>
           </w:p>
         </w:tc>
@@ -5013,36 +5034,28 @@
         <w:tc>
           <w:tcPr>
             <w:tcW w:w="4968" w:type="dxa"/>
-            <w:shd w:val="clear" w:color="auto" w:fill="F2F6FC"/>
-            <w:vAlign w:val="center"/>
-          </w:tcPr>
-          <w:p>
-            <w:pPr>
-              <w:spacing w:after="20"/>
-            </w:pPr>
-            <w:r>
-              <w:rPr>
-                <w:sz w:val="17"/>
-              </w:rPr>
-              <w:t>AC-08</w:t>
+            <w:vAlign w:val="center"/>
+          </w:tcPr>
+          <w:p>
+            <w:pPr>
+              <w:spacing w:after="20"/>
+            </w:pPr>
+            <w:r>
+              <w:t>AC-05d</w:t>
             </w:r>
           </w:p>
         </w:tc>
         <w:tc>
           <w:tcPr>
             <w:tcW w:w="4968" w:type="dxa"/>
-            <w:shd w:val="clear" w:color="auto" w:fill="F2F6FC"/>
-            <w:vAlign w:val="center"/>
-          </w:tcPr>
-          <w:p>
-            <w:pPr>
-              <w:spacing w:after="20"/>
-            </w:pPr>
-            <w:r>
-              <w:rPr>
-                <w:sz w:val="17"/>
-              </w:rPr>
-              <w:t>Đánh giá mới không công khai trước khi Admin duyệt.</w:t>
+            <w:vAlign w:val="center"/>
+          </w:tcPr>
+          <w:p>
+            <w:pPr>
+              <w:spacing w:after="20"/>
+            </w:pPr>
+            <w:r>
+              <w:t>Hồ sơ PT chỉ hiển thị các phòng tập đang hoạt động; phòng tập tạm ẩn không xuất hiện như nơi làm việc công khai; các phòng tập hoạt động khác của PT vẫn hiển thị.</w:t>
             </w:r>
           </w:p>
         </w:tc>
@@ -5062,10 +5075,7 @@
               <w:spacing w:after="20"/>
             </w:pPr>
             <w:r>
-              <w:rPr>
-                <w:sz w:val="17"/>
-              </w:rPr>
-              <w:t>AC-09</w:t>
+              <w:t>AC-05e</w:t>
             </w:r>
           </w:p>
         </w:tc>
@@ -5079,10 +5089,7 @@
               <w:spacing w:after="20"/>
             </w:pPr>
             <w:r>
-              <w:rPr>
-                <w:sz w:val="17"/>
-              </w:rPr>
-              <w:t>Đánh giá bị từ chối không được tính vào điểm trung bình công khai.</w:t>
+              <w:t>Admin quản lý liên kết nhiều phòng tập cho một PT mà không tạo hồ sơ PT trùng; mỗi PT phải còn ít nhất một liên kết phòng tập.</w:t>
             </w:r>
           </w:p>
         </w:tc>
@@ -5106,7 +5113,7 @@
               <w:rPr>
                 <w:sz w:val="17"/>
               </w:rPr>
-              <w:t>AC-10</w:t>
+              <w:t>AC-06</w:t>
             </w:r>
           </w:p>
         </w:tc>
@@ -5117,14 +5124,8 @@
             <w:vAlign w:val="center"/>
           </w:tcPr>
           <w:p>
-            <w:pPr>
-              <w:spacing w:after="20"/>
-            </w:pPr>
-            <w:r>
-              <w:rPr>
-                <w:sz w:val="17"/>
-              </w:rPr>
-              <w:t>Admin thêm/sửa/ẩn-hiện phòng tập và quản lý trạng thái PT.</w:t>
+            <w:r>
+              <w:t>User đăng ký/đăng nhập/đăng xuất, xem và cập nhật hồ sơ cá nhân, đổi mật khẩu.</w:t>
             </w:r>
           </w:p>
         </w:tc>
@@ -5147,7 +5148,7 @@
               <w:rPr>
                 <w:sz w:val="17"/>
               </w:rPr>
-              <w:t>AC-11</w:t>
+              <w:t>AC-07</w:t>
             </w:r>
           </w:p>
         </w:tc>
@@ -5164,7 +5165,7 @@
               <w:rPr>
                 <w:sz w:val="17"/>
               </w:rPr>
-              <w:t>Admin quản lý danh mục, tiện ích, chuyên môn và khu vực.</w:t>
+              <w:t>User thêm/bỏ yêu thích phòng tập và PT; danh sách không trùng mục.</w:t>
             </w:r>
           </w:p>
         </w:tc>
@@ -5188,7 +5189,7 @@
               <w:rPr>
                 <w:sz w:val="17"/>
               </w:rPr>
-              <w:t>AC-12</w:t>
+              <w:t>AC-08</w:t>
             </w:r>
           </w:p>
         </w:tc>
@@ -5206,7 +5207,7 @@
               <w:rPr>
                 <w:sz w:val="17"/>
               </w:rPr>
-              <w:t>Admin khóa/mở khóa User và duyệt/từ chối đánh giá.</w:t>
+              <w:t>Đánh giá mới không công khai trước khi Admin duyệt.</w:t>
             </w:r>
           </w:p>
         </w:tc>
@@ -5229,7 +5230,7 @@
               <w:rPr>
                 <w:sz w:val="17"/>
               </w:rPr>
-              <w:t>AC-13</w:t>
+              <w:t>AC-09</w:t>
             </w:r>
           </w:p>
         </w:tc>
@@ -5246,7 +5247,7 @@
               <w:rPr>
                 <w:sz w:val="17"/>
               </w:rPr>
-              <w:t>Dashboard phản ánh số liệu thực tế theo định nghĩa thống nhất.</w:t>
+              <w:t>Đánh giá bị từ chối không được tính vào điểm trung bình công khai.</w:t>
             </w:r>
           </w:p>
         </w:tc>
@@ -5270,7 +5271,7 @@
               <w:rPr>
                 <w:sz w:val="17"/>
               </w:rPr>
-              <w:t>AC-14</w:t>
+              <w:t>AC-10</w:t>
             </w:r>
           </w:p>
         </w:tc>
@@ -5285,10 +5286,7 @@
               <w:spacing w:after="20"/>
             </w:pPr>
             <w:r>
-              <w:rPr>
-                <w:sz w:val="17"/>
-              </w:rPr>
-              <w:t>Không có bản đồ, tọa độ nhập trên UI, bản đồ nhúng hoặc nút/liên kết chỉ đường ở User/Admin.</w:t>
+              <w:t>Admin thêm/sửa/tạm ẩn–kích hoạt phòng tập và quản lý trạng thái PT (không xóa cứng trên giao diện).</w:t>
             </w:r>
           </w:p>
         </w:tc>
@@ -5311,7 +5309,7 @@
               <w:rPr>
                 <w:sz w:val="17"/>
               </w:rPr>
-              <w:t>AC-15</w:t>
+              <w:t>AC-11</w:t>
             </w:r>
           </w:p>
         </w:tc>
@@ -5328,7 +5326,7 @@
               <w:rPr>
                 <w:sz w:val="17"/>
               </w:rPr>
-              <w:t>Không có đặt lịch, thanh toán hoặc chat.</w:t>
+              <w:t>Admin quản lý danh mục, tiện ích, chuyên môn và khu vực.</w:t>
             </w:r>
           </w:p>
         </w:tc>
@@ -5352,7 +5350,7 @@
               <w:rPr>
                 <w:sz w:val="17"/>
               </w:rPr>
-              <w:t>AC-16</w:t>
+              <w:t>AC-12</w:t>
             </w:r>
           </w:p>
         </w:tc>
@@ -5370,7 +5368,7 @@
               <w:rPr>
                 <w:sz w:val="17"/>
               </w:rPr>
-              <w:t>Các trang chính hoạt động trên desktop và không vỡ bố cục nghiêm trọng ở màn hình nhỏ.</w:t>
+              <w:t>Admin khóa/mở khóa User và duyệt/từ chối đánh giá.</w:t>
             </w:r>
           </w:p>
         </w:tc>
@@ -5393,7 +5391,7 @@
               <w:rPr>
                 <w:sz w:val="17"/>
               </w:rPr>
-              <w:t>AC-17</w:t>
+              <w:t>AC-13</w:t>
             </w:r>
           </w:p>
         </w:tc>
@@ -5410,95 +5408,171 @@
               <w:rPr>
                 <w:sz w:val="17"/>
               </w:rPr>
-              <w:t>Backend kiểm tra phân quyền cho thao tác tài khoản và quản trị.</w:t>
+              <w:t>Dashboard phản ánh số liệu thực tế theo định nghĩa thống nhất.</w:t>
             </w:r>
           </w:p>
         </w:tc>
       </w:tr>
       <w:tr>
-        <w:tc>
-          <w:tcPr>
-            <w:tcW w:type="dxa" w:w="4963"/>
-          </w:tcPr>
-          <w:p>
-            <w:r>
-              <w:t>AC-18</w:t>
-            </w:r>
-          </w:p>
-        </w:tc>
-        <w:tc>
-          <w:tcPr>
-            <w:tcW w:type="dxa" w:w="4963"/>
-          </w:tcPr>
-          <w:p>
-            <w:r>
-              <w:t>Nhấn Từ chối mở modal nhập lý do.</w:t>
+        <w:trPr>
+          <w:cantSplit/>
+          <w:jc w:val="center"/>
+        </w:trPr>
+        <w:tc>
+          <w:tcPr>
+            <w:tcW w:w="4968" w:type="dxa"/>
+            <w:shd w:val="clear" w:color="auto" w:fill="F2F6FC"/>
+            <w:vAlign w:val="center"/>
+          </w:tcPr>
+          <w:p>
+            <w:pPr>
+              <w:spacing w:after="20"/>
+            </w:pPr>
+            <w:r>
+              <w:rPr>
+                <w:sz w:val="17"/>
+              </w:rPr>
+              <w:t>AC-14</w:t>
+            </w:r>
+          </w:p>
+        </w:tc>
+        <w:tc>
+          <w:tcPr>
+            <w:tcW w:w="4968" w:type="dxa"/>
+            <w:shd w:val="clear" w:color="auto" w:fill="F2F6FC"/>
+            <w:vAlign w:val="center"/>
+          </w:tcPr>
+          <w:p>
+            <w:pPr>
+              <w:spacing w:after="20"/>
+            </w:pPr>
+            <w:r>
+              <w:rPr>
+                <w:sz w:val="17"/>
+              </w:rPr>
+              <w:t>Không có bản đồ, tọa độ nhập trên UI, bản đồ nhúng hoặc nút/liên kết chỉ đường ở User/Admin.</w:t>
             </w:r>
           </w:p>
         </w:tc>
       </w:tr>
       <w:tr>
-        <w:tc>
-          <w:tcPr>
-            <w:tcW w:type="dxa" w:w="4963"/>
-          </w:tcPr>
-          <w:p>
-            <w:r>
-              <w:t>AC-19</w:t>
-            </w:r>
-          </w:p>
-        </w:tc>
-        <w:tc>
-          <w:tcPr>
-            <w:tcW w:type="dxa" w:w="4963"/>
-          </w:tcPr>
-          <w:p>
-            <w:r>
-              <w:t>Để trống lý do thì không thể xác nhận.</w:t>
+        <w:trPr>
+          <w:cantSplit/>
+          <w:jc w:val="center"/>
+        </w:trPr>
+        <w:tc>
+          <w:tcPr>
+            <w:tcW w:w="4968" w:type="dxa"/>
+            <w:vAlign w:val="center"/>
+          </w:tcPr>
+          <w:p>
+            <w:pPr>
+              <w:spacing w:after="20"/>
+            </w:pPr>
+            <w:r>
+              <w:rPr>
+                <w:sz w:val="17"/>
+              </w:rPr>
+              <w:t>AC-15</w:t>
+            </w:r>
+          </w:p>
+        </w:tc>
+        <w:tc>
+          <w:tcPr>
+            <w:tcW w:w="4968" w:type="dxa"/>
+            <w:vAlign w:val="center"/>
+          </w:tcPr>
+          <w:p>
+            <w:pPr>
+              <w:spacing w:after="20"/>
+            </w:pPr>
+            <w:r>
+              <w:rPr>
+                <w:sz w:val="17"/>
+              </w:rPr>
+              <w:t>Không có đặt lịch, thanh toán hoặc chat.</w:t>
             </w:r>
           </w:p>
         </w:tc>
       </w:tr>
       <w:tr>
-        <w:tc>
-          <w:tcPr>
-            <w:tcW w:type="dxa" w:w="4963"/>
-          </w:tcPr>
-          <w:p>
-            <w:r>
-              <w:t>AC-20</w:t>
-            </w:r>
-          </w:p>
-        </w:tc>
-        <w:tc>
-          <w:tcPr>
-            <w:tcW w:type="dxa" w:w="4963"/>
-          </w:tcPr>
-          <w:p>
-            <w:r>
-              <w:t>Nhập lý do hợp lệ thì có thể xác nhận từ chối theo luồng xử lý hiện tại.</w:t>
+        <w:trPr>
+          <w:cantSplit/>
+          <w:jc w:val="center"/>
+        </w:trPr>
+        <w:tc>
+          <w:tcPr>
+            <w:tcW w:w="4968" w:type="dxa"/>
+            <w:shd w:val="clear" w:color="auto" w:fill="F2F6FC"/>
+            <w:vAlign w:val="center"/>
+          </w:tcPr>
+          <w:p>
+            <w:pPr>
+              <w:spacing w:after="20"/>
+            </w:pPr>
+            <w:r>
+              <w:rPr>
+                <w:sz w:val="17"/>
+              </w:rPr>
+              <w:t>AC-16</w:t>
+            </w:r>
+          </w:p>
+        </w:tc>
+        <w:tc>
+          <w:tcPr>
+            <w:tcW w:w="4968" w:type="dxa"/>
+            <w:shd w:val="clear" w:color="auto" w:fill="F2F6FC"/>
+            <w:vAlign w:val="center"/>
+          </w:tcPr>
+          <w:p>
+            <w:pPr>
+              <w:spacing w:after="20"/>
+            </w:pPr>
+            <w:r>
+              <w:rPr>
+                <w:sz w:val="17"/>
+              </w:rPr>
+              <w:t>Các trang chính hoạt động trên desktop và không vỡ bố cục nghiêm trọng ở màn hình nhỏ.</w:t>
             </w:r>
           </w:p>
         </w:tc>
       </w:tr>
       <w:tr>
-        <w:tc>
-          <w:tcPr>
-            <w:tcW w:type="dxa" w:w="4963"/>
-          </w:tcPr>
-          <w:p>
-            <w:r>
-              <w:t>AC-21</w:t>
-            </w:r>
-          </w:p>
-        </w:tc>
-        <w:tc>
-          <w:tcPr>
-            <w:tcW w:type="dxa" w:w="4963"/>
-          </w:tcPr>
-          <w:p>
-            <w:r>
-              <w:t>Nhấn Hủy không làm thay đổi trạng thái.</w:t>
+        <w:trPr>
+          <w:cantSplit/>
+          <w:jc w:val="center"/>
+        </w:trPr>
+        <w:tc>
+          <w:tcPr>
+            <w:tcW w:w="4968" w:type="dxa"/>
+            <w:vAlign w:val="center"/>
+          </w:tcPr>
+          <w:p>
+            <w:pPr>
+              <w:spacing w:after="20"/>
+            </w:pPr>
+            <w:r>
+              <w:rPr>
+                <w:sz w:val="17"/>
+              </w:rPr>
+              <w:t>AC-17</w:t>
+            </w:r>
+          </w:p>
+        </w:tc>
+        <w:tc>
+          <w:tcPr>
+            <w:tcW w:w="4968" w:type="dxa"/>
+            <w:vAlign w:val="center"/>
+          </w:tcPr>
+          <w:p>
+            <w:pPr>
+              <w:spacing w:after="20"/>
+            </w:pPr>
+            <w:r>
+              <w:rPr>
+                <w:sz w:val="17"/>
+              </w:rPr>
+              <w:t>Backend kiểm tra phân quyền cho thao tác tài khoản và quản trị.</w:t>
             </w:r>
           </w:p>
         </w:tc>
@@ -5510,7 +5584,7 @@
           </w:tcPr>
           <w:p>
             <w:r>
-              <w:t>AC-22</w:t>
+              <w:t>AC-18</w:t>
             </w:r>
           </w:p>
         </w:tc>
@@ -5520,7 +5594,7 @@
           </w:tcPr>
           <w:p>
             <w:r>
-              <w:t>Không ảnh hưởng đến chức năng duyệt đánh giá.</w:t>
+              <w:t>Nhấn Từ chối mở modal nhập lý do.</w:t>
             </w:r>
           </w:p>
         </w:tc>
@@ -5532,6 +5606,94 @@
           </w:tcPr>
           <w:p>
             <w:r>
+              <w:t>AC-19</w:t>
+            </w:r>
+          </w:p>
+        </w:tc>
+        <w:tc>
+          <w:tcPr>
+            <w:tcW w:type="dxa" w:w="4963"/>
+          </w:tcPr>
+          <w:p>
+            <w:r>
+              <w:t>Để trống lý do thì không thể xác nhận.</w:t>
+            </w:r>
+          </w:p>
+        </w:tc>
+      </w:tr>
+      <w:tr>
+        <w:tc>
+          <w:tcPr>
+            <w:tcW w:type="dxa" w:w="4963"/>
+          </w:tcPr>
+          <w:p>
+            <w:r>
+              <w:t>AC-20</w:t>
+            </w:r>
+          </w:p>
+        </w:tc>
+        <w:tc>
+          <w:tcPr>
+            <w:tcW w:type="dxa" w:w="4963"/>
+          </w:tcPr>
+          <w:p>
+            <w:r>
+              <w:t>Nhập lý do hợp lệ thì có thể xác nhận từ chối theo luồng xử lý hiện tại.</w:t>
+            </w:r>
+          </w:p>
+        </w:tc>
+      </w:tr>
+      <w:tr>
+        <w:tc>
+          <w:tcPr>
+            <w:tcW w:type="dxa" w:w="4963"/>
+          </w:tcPr>
+          <w:p>
+            <w:r>
+              <w:t>AC-21</w:t>
+            </w:r>
+          </w:p>
+        </w:tc>
+        <w:tc>
+          <w:tcPr>
+            <w:tcW w:type="dxa" w:w="4963"/>
+          </w:tcPr>
+          <w:p>
+            <w:r>
+              <w:t>Nhấn Hủy không làm thay đổi trạng thái.</w:t>
+            </w:r>
+          </w:p>
+        </w:tc>
+      </w:tr>
+      <w:tr>
+        <w:tc>
+          <w:tcPr>
+            <w:tcW w:type="dxa" w:w="4963"/>
+          </w:tcPr>
+          <w:p>
+            <w:r>
+              <w:t>AC-22</w:t>
+            </w:r>
+          </w:p>
+        </w:tc>
+        <w:tc>
+          <w:tcPr>
+            <w:tcW w:type="dxa" w:w="4963"/>
+          </w:tcPr>
+          <w:p>
+            <w:r>
+              <w:t>Không ảnh hưởng đến chức năng duyệt đánh giá.</w:t>
+            </w:r>
+          </w:p>
+        </w:tc>
+      </w:tr>
+      <w:tr>
+        <w:tc>
+          <w:tcPr>
+            <w:tcW w:type="dxa" w:w="4963"/>
+          </w:tcPr>
+          <w:p>
+            <w:r>
               <w:t>AC-23</w:t>
             </w:r>
           </w:p>
@@ -5543,6 +5705,160 @@
           <w:p>
             <w:r>
               <w:t>Không khẳng định lý do đã được lưu bền vững nếu Backend chưa hỗ trợ.</w:t>
+            </w:r>
+          </w:p>
+        </w:tc>
+      </w:tr>
+      <w:tr>
+        <w:tc>
+          <w:tcPr>
+            <w:tcW w:type="dxa" w:w="4963"/>
+          </w:tcPr>
+          <w:p>
+            <w:r>
+              <w:t>AC-24</w:t>
+            </w:r>
+          </w:p>
+        </w:tc>
+        <w:tc>
+          <w:tcPr>
+            <w:tcW w:type="dxa" w:w="4963"/>
+          </w:tcPr>
+          <w:p>
+            <w:r>
+              <w:t>Admin có thể tạm ẩn và kích hoạt lại HLV; trạng thái được cập nhật đúng thực tế và HLV tạm ẩn không còn xuất hiện trên các trang công khai.</w:t>
+            </w:r>
+          </w:p>
+        </w:tc>
+      </w:tr>
+      <w:tr>
+        <w:tc>
+          <w:tcPr>
+            <w:tcW w:type="dxa" w:w="4963"/>
+          </w:tcPr>
+          <w:p>
+            <w:r>
+              <w:t>AC-25</w:t>
+            </w:r>
+          </w:p>
+        </w:tc>
+        <w:tc>
+          <w:tcPr>
+            <w:tcW w:type="dxa" w:w="4963"/>
+          </w:tcPr>
+          <w:p>
+            <w:r>
+              <w:t>Giao diện quản trị HLV không có nút Xóa cứng; Admin chỉ dùng Tạm ẩn / Kích hoạt lại để quản lý hiển thị công khai.</w:t>
+            </w:r>
+          </w:p>
+        </w:tc>
+      </w:tr>
+      <w:tr>
+        <w:tc>
+          <w:tcPr>
+            <w:tcW w:type="dxa" w:w="4963"/>
+          </w:tcPr>
+          <w:p>
+            <w:r>
+              <w:t>AC-26</w:t>
+            </w:r>
+          </w:p>
+        </w:tc>
+        <w:tc>
+          <w:tcPr>
+            <w:tcW w:type="dxa" w:w="4963"/>
+          </w:tcPr>
+          <w:p>
+            <w:r>
+              <w:t>Giao diện quản trị phòng tập không có nút Xóa cứng; Admin chỉ dùng Tạm ẩn / Kích hoạt lại để quản lý hiển thị công khai.</w:t>
+            </w:r>
+          </w:p>
+        </w:tc>
+      </w:tr>
+      <w:tr>
+        <w:tc>
+          <w:tcPr>
+            <w:tcW w:type="dxa" w:w="4963"/>
+          </w:tcPr>
+          <w:p>
+            <w:r>
+              <w:t>AC-27</w:t>
+            </w:r>
+          </w:p>
+        </w:tc>
+        <w:tc>
+          <w:tcPr>
+            <w:tcW w:type="dxa" w:w="4963"/>
+          </w:tcPr>
+          <w:p>
+            <w:r>
+              <w:t>Gym tạm ẩn không xuất hiện trên trang danh sách, tìm kiếm công khai và danh sách yêu thích; Admin có thể kích hoạt lại.</w:t>
+            </w:r>
+          </w:p>
+        </w:tc>
+      </w:tr>
+      <w:tr>
+        <w:tc>
+          <w:tcPr>
+            <w:tcW w:type="dxa" w:w="4963"/>
+          </w:tcPr>
+          <w:p>
+            <w:r>
+              <w:t>AC-28</w:t>
+            </w:r>
+          </w:p>
+        </w:tc>
+        <w:tc>
+          <w:tcPr>
+            <w:tcW w:type="dxa" w:w="4963"/>
+          </w:tcPr>
+          <w:p>
+            <w:r>
+              <w:t>Khóa hoặc mở khóa tài khoản User không làm mất dữ liệu lịch sử đánh giá hoặc hoạt động trước đó.</w:t>
+            </w:r>
+          </w:p>
+        </w:tc>
+      </w:tr>
+      <w:tr>
+        <w:tc>
+          <w:tcPr>
+            <w:tcW w:type="dxa" w:w="4963"/>
+          </w:tcPr>
+          <w:p>
+            <w:r>
+              <w:t>AC-29</w:t>
+            </w:r>
+          </w:p>
+        </w:tc>
+        <w:tc>
+          <w:tcPr>
+            <w:tcW w:type="dxa" w:w="4963"/>
+          </w:tcPr>
+          <w:p>
+            <w:r>
+              <w:t>Khi thao tác quản trị thất bại hoặc chưa được Backend hỗ trợ, hệ thống hiển thị thông báo lỗi phù hợp, không giả lập giao diện thành công.</w:t>
+            </w:r>
+          </w:p>
+        </w:tc>
+      </w:tr>
+      <w:tr>
+        <w:tc>
+          <w:tcPr>
+            <w:tcW w:type="dxa" w:w="4963"/>
+          </w:tcPr>
+          <w:p>
+            <w:r>
+              <w:t>AC-30</w:t>
+            </w:r>
+          </w:p>
+        </w:tc>
+        <w:tc>
+          <w:tcPr>
+            <w:tcW w:type="dxa" w:w="4963"/>
+          </w:tcPr>
+          <w:p>
+            <w:r>
+              <w:t>Mọi thao tác quản trị (Tạm ẩn, Kích hoạt, Khóa tài khoản và các thao tác còn lại trên giao diện) đều được Backend kiểm tra phân quyền Admin và CSRF token nghiêm ngặt; người không có quyền Admin bị chặn với mã lỗi 403 Forbidden.</w:t>
             </w:r>
           </w:p>
         </w:tc>
@@ -5635,7 +5951,7 @@
           </w:tcPr>
           <w:p>
             <w:r>
-              <w:t>Xác thực/phân quyền; tìm kiếm phòng tập; trang chi tiết Gym/PT; hồ sơ cá nhân và đổi mật khẩu; nhiều chuyên môn/PT; yêu thích; đánh giá/kiểm duyệt (bắt buộc nhập lý do khi từ chối); quản trị dữ liệu cốt lõi; loại bỏ bản đồ/chỉ đường.</w:t>
+              <w:t>Xác thực/phân quyền (đăng ký có SĐT tuỳ chọn, đăng nhập email/SĐT, ghi nhớ đăng nhập); tìm kiếm phòng tập; trang chi tiết Gym/PT; hồ sơ cá nhân và đổi mật khẩu; quan hệ nhiều–nhiều Trainer–Specialty (trainer_specialties) và Gym–Trainer (gym_trainers) theo thiết kế CSDL — giao diện quản trị/public đã sẵn sàng nhận nhiều liên kết; yêu thích; đánh giá/kiểm duyệt (bắt buộc nhập lý do khi từ chối); quản trị dữ liệu cốt lõi; loại bỏ bản đồ/chỉ đường.</w:t>
             </w:r>
           </w:p>
         </w:tc>
@@ -5711,7 +6027,7 @@
               <w:rPr>
                 <w:sz w:val="17"/>
               </w:rPr>
-              <w:t>Cải tiến UX nhỏ hoặc báo cáo quản trị bổ sung nếu đủ thời gian và không ảnh hưởng P0.</w:t>
+              <w:t>Quên mật khẩu (UI sẵn sàng; gửi email/token đặt lại mật khẩu bổ sung phía máy chủ khi đủ hạ tầng); trang Điều khoản dịch vụ và Chính sách bảo mật; cải tiến UX nhỏ hoặc báo cáo quản trị bổ sung nếu đủ thời gian và không ảnh hưởng P0.</w:t>
             </w:r>
           </w:p>
         </w:tc>
@@ -6126,8 +6442,8 @@
     <w:p/>
     <w:p/>
     <w:sectPr>
-      <w:headerReference w:type="default" r:id="rId8"/>
-      <w:footerReference w:type="default" r:id="rId9"/>
+      <w:headerReference w:type="default" ns2:id="rId8"/>
+      <w:footerReference w:type="default" ns2:id="rId9"/>
       <w:pgSz w:w="12240" w:h="15840"/>
       <w:pgMar w:top="1008" w:right="1152" w:bottom="1008" w:left="1152" w:header="720" w:footer="720" w:gutter="0"/>
       <w:cols w:space="720"/>

</xml_diff>